<commit_message>
Literatura u ranijim materijalima (STAT_DAS, ISFVSP, STAT_IAS 2025 N04–N06), OIT N01 video sa slajdom literature; N03 vežba bez literature
Co-Authored-By: Claude Opus 5.5 <noreply@anthropic.com>
</commit_message>
<xml_diff>
--- a/predmeti/stat-ias/n03/STAT_IAS_N03_Exercise_SR.docx
+++ b/predmeti/stat-ias/n03/STAT_IAS_N03_Exercise_SR.docx
@@ -27,7 +27,7 @@
           <w:color w:val="66707A"/>
           <w:sz w:val="20"/>
         </w:rPr>
-        <w:t>Četvrtak, 22. 10. 2026 · 90 minuta · Džamovi (jamovi) i Eksel (Excel)</w:t>
+        <w:t>Četvrtak, 22. 10. 2026 · 90 minuta · Džamovi i Eksel</w:t>
       </w:r>
     </w:p>
     <w:p>
@@ -1566,146 +1566,6 @@
     </w:p>
     <w:p>
       <w:pPr>
-        <w:pStyle w:val="Heading1"/>
-      </w:pPr>
-      <w:r>
-        <w:t>Literatura</w:t>
-      </w:r>
-    </w:p>
-    <w:p>
-      <w:pPr>
-        <w:ind w:left="454" w:hanging="454"/>
-      </w:pPr>
-      <w:r>
-        <w:rPr>
-          <w:i w:val="0"/>
-          <w:sz w:val="20"/>
-        </w:rPr>
-        <w:t xml:space="preserve">Dizdar, D. (2006). </w:t>
-      </w:r>
-      <w:r>
-        <w:rPr>
-          <w:i/>
-          <w:sz w:val="20"/>
-        </w:rPr>
-        <w:t>Kvantitativne metode</w:t>
-      </w:r>
-      <w:r>
-        <w:rPr>
-          <w:i w:val="0"/>
-          <w:sz w:val="20"/>
-        </w:rPr>
-        <w:t>. Kineziološki fakultet Sveučilišta u Zagrebu.</w:t>
-      </w:r>
-    </w:p>
-    <w:p>
-      <w:pPr>
-        <w:ind w:left="454" w:hanging="454"/>
-      </w:pPr>
-      <w:r>
-        <w:rPr>
-          <w:i w:val="0"/>
-          <w:sz w:val="20"/>
-        </w:rPr>
-        <w:t xml:space="preserve">Hyndman, R. J., &amp; Fan, Y. (1996). Sample quantiles in statistical packages. </w:t>
-      </w:r>
-      <w:r>
-        <w:rPr>
-          <w:i/>
-          <w:sz w:val="20"/>
-        </w:rPr>
-        <w:t>The American Statistician</w:t>
-      </w:r>
-      <w:r>
-        <w:rPr>
-          <w:i w:val="0"/>
-          <w:sz w:val="20"/>
-        </w:rPr>
-        <w:t xml:space="preserve">, </w:t>
-      </w:r>
-      <w:r>
-        <w:rPr>
-          <w:i/>
-          <w:sz w:val="20"/>
-        </w:rPr>
-        <w:t>50</w:t>
-      </w:r>
-      <w:r>
-        <w:rPr>
-          <w:i w:val="0"/>
-          <w:sz w:val="20"/>
-        </w:rPr>
-        <w:t>(4), 361–365. https://doi.org/10.1080/00031305.1996.10473566</w:t>
-      </w:r>
-    </w:p>
-    <w:p>
-      <w:pPr>
-        <w:ind w:left="454" w:hanging="454"/>
-      </w:pPr>
-      <w:r>
-        <w:rPr>
-          <w:i w:val="0"/>
-          <w:sz w:val="20"/>
-        </w:rPr>
-        <w:t xml:space="preserve">Mandić, R., Knežević, O. M., Mirkov, D. M., &amp; Jarić, S. (2016). Control strategy of maximum vertical jumps: The preferred countermovement depth may not be fully optimized for jump height. </w:t>
-      </w:r>
-      <w:r>
-        <w:rPr>
-          <w:i/>
-          <w:sz w:val="20"/>
-        </w:rPr>
-        <w:t>Journal of Human Kinetics</w:t>
-      </w:r>
-      <w:r>
-        <w:rPr>
-          <w:i w:val="0"/>
-          <w:sz w:val="20"/>
-        </w:rPr>
-        <w:t xml:space="preserve">, </w:t>
-      </w:r>
-      <w:r>
-        <w:rPr>
-          <w:i/>
-          <w:sz w:val="20"/>
-        </w:rPr>
-        <w:t>52</w:t>
-      </w:r>
-      <w:r>
-        <w:rPr>
-          <w:i w:val="0"/>
-          <w:sz w:val="20"/>
-        </w:rPr>
-        <w:t>, 85–94. https://doi.org/10.1515/hukin-2015-0196</w:t>
-      </w:r>
-    </w:p>
-    <w:p>
-      <w:pPr>
-        <w:ind w:left="454" w:hanging="454"/>
-      </w:pPr>
-      <w:r>
-        <w:rPr>
-          <w:i w:val="0"/>
-          <w:sz w:val="20"/>
-        </w:rPr>
-        <w:t xml:space="preserve">Weir, J. P., &amp; Vincent, W. J. (2021). </w:t>
-      </w:r>
-      <w:r>
-        <w:rPr>
-          <w:i/>
-          <w:sz w:val="20"/>
-        </w:rPr>
-        <w:t>Statistics in kinesiology</w:t>
-      </w:r>
-      <w:r>
-        <w:rPr>
-          <w:i w:val="0"/>
-          <w:sz w:val="20"/>
-        </w:rPr>
-        <w:t xml:space="preserve"> (5th ed.). Human Kinetics.</w:t>
-      </w:r>
-    </w:p>
-    <w:p>
-      <w:pPr>
         <w:spacing w:before="240"/>
       </w:pPr>
       <w:r>

</xml_diff>